<commit_message>
Keep every verified credential in compact resumes and validate local image dimensions
- Include credentials without a public link in the one-page resume (as plain text); tighten condensed bullets to keep one page
- Content check now reads local WebP headers and compares them to the declared width and height
</commit_message>
<xml_diff>
--- a/public/resume/mohamed-moheyeldin-resume-one-page.docx
+++ b/public/resume/mohamed-moheyeldin-resume-one-page.docx
@@ -220,7 +220,7 @@
           <w:color w:val="171717"/>
           <w:sz w:val="18"/>
         </w:rPr>
-        <w:t>Contribute React, TypeScript, and JavaScript features; investigate data issues across frontend, backend, and MySQL.</w:t>
+        <w:t>Contribute React, TypeScript, and JavaScript features; trace data issues across frontend, backend, MySQL.</w:t>
       </w:r>
     </w:p>
     <w:p>
@@ -237,7 +237,7 @@
           <w:color w:val="171717"/>
           <w:sz w:val="18"/>
         </w:rPr>
-        <w:t>Built Data Generator &amp; File Processing (used daily; a full dev database or up to 10,000 records in under 5 minutes) and a Playwright framework that helps reduce production bugs.</w:t>
+        <w:t>Built Data Generator &amp; File Processing (used daily; full dev database in under 5 minutes) and a Playwright framework that helps reduce production bugs.</w:t>
       </w:r>
     </w:p>
     <w:p>
@@ -711,6 +711,40 @@
         </w:r>
       </w:hyperlink>
     </w:p>
+    <w:p>
+      <w:pPr>
+        <w:spacing w:after="44" w:line="245" w:lineRule="auto"/>
+      </w:pPr>
+      <w:r>
+        <w:rPr>
+          <w:rFonts w:ascii="Inter" w:hAnsi="Inter"/>
+          <w:b w:val="0"/>
+          <w:i w:val="0"/>
+          <w:color w:val="171717"/>
+          <w:sz w:val="19"/>
+        </w:rPr>
+      </w:r>
+      <w:r>
+        <w:rPr>
+          <w:rFonts w:ascii="Inter" w:hAnsi="Inter"/>
+          <w:b w:val="0"/>
+          <w:i w:val="0"/>
+          <w:color w:val="171717"/>
+          <w:sz w:val="19"/>
+        </w:rPr>
+        <w:t xml:space="preserve">Scaled Agile | Issued 2021: </w:t>
+      </w:r>
+      <w:r>
+        <w:rPr>
+          <w:rFonts w:ascii="Inter" w:hAnsi="Inter"/>
+          <w:b w:val="0"/>
+          <w:i w:val="0"/>
+          <w:color w:val="171717"/>
+          <w:sz w:val="19"/>
+        </w:rPr>
+        <w:t>Implementing SAFe Course (5.1)</w:t>
+      </w:r>
+    </w:p>
     <w:sectPr>
       <w:footerReference w:type="default" r:id="rId16"/>
       <w:pgSz w:w="12240" w:h="15840"/>

</xml_diff>